<commit_message>
docs(s08): ajustar anchos de tabla y tamano de capturas en el informe
</commit_message>
<xml_diff>
--- a/docs/entrega/S08_ActividadAutonoma_RodriguezBazan.docx
+++ b/docs/entrega/S08_ActividadAutonoma_RodriguezBazan.docx
@@ -393,6 +393,7 @@
       <w:tblPr>
         <w:tblW w:type="auto" w:w="0"/>
         <w:jc w:val="center"/>
+        <w:tblLayout w:type="fixed"/>
         <w:tblLook w:firstColumn="1" w:firstRow="1" w:lastColumn="0" w:lastRow="0" w:noHBand="0" w:noVBand="1" w:val="04A0"/>
         <w:tblBorders>
           <w:top w:val="single" w:sz="6" w:color="9DC3E6"/>
@@ -432,7 +433,7 @@
         </w:tc>
         <w:tc>
           <w:tcPr>
-            <w:tcW w:type="dxa" w:w="1814"/>
+            <w:tcW w:type="dxa" w:w="1701"/>
             <w:shd w:val="clear" w:color="auto" w:fill="1F4E79"/>
           </w:tcPr>
           <w:p>
@@ -449,7 +450,7 @@
         </w:tc>
         <w:tc>
           <w:tcPr>
-            <w:tcW w:type="dxa" w:w="1928"/>
+            <w:tcW w:type="dxa" w:w="1814"/>
             <w:shd w:val="clear" w:color="auto" w:fill="1F4E79"/>
           </w:tcPr>
           <w:p>
@@ -483,7 +484,7 @@
         </w:tc>
         <w:tc>
           <w:tcPr>
-            <w:tcW w:type="dxa" w:w="850"/>
+            <w:tcW w:type="dxa" w:w="964"/>
             <w:shd w:val="clear" w:color="auto" w:fill="1F4E79"/>
           </w:tcPr>
           <w:p>
@@ -500,7 +501,7 @@
         </w:tc>
         <w:tc>
           <w:tcPr>
-            <w:tcW w:type="dxa" w:w="850"/>
+            <w:tcW w:type="dxa" w:w="964"/>
             <w:shd w:val="clear" w:color="auto" w:fill="1F4E79"/>
           </w:tcPr>
           <w:p>
@@ -550,7 +551,7 @@
         </w:tc>
         <w:tc>
           <w:tcPr>
-            <w:tcW w:type="dxa" w:w="1814"/>
+            <w:tcW w:type="dxa" w:w="1701"/>
           </w:tcPr>
           <w:p>
             <w:r/>
@@ -564,7 +565,7 @@
         </w:tc>
         <w:tc>
           <w:tcPr>
-            <w:tcW w:type="dxa" w:w="1928"/>
+            <w:tcW w:type="dxa" w:w="1814"/>
           </w:tcPr>
           <w:p>
             <w:r/>
@@ -592,7 +593,7 @@
         </w:tc>
         <w:tc>
           <w:tcPr>
-            <w:tcW w:type="dxa" w:w="850"/>
+            <w:tcW w:type="dxa" w:w="964"/>
           </w:tcPr>
           <w:p>
             <w:r/>
@@ -606,7 +607,7 @@
         </w:tc>
         <w:tc>
           <w:tcPr>
-            <w:tcW w:type="dxa" w:w="850"/>
+            <w:tcW w:type="dxa" w:w="964"/>
           </w:tcPr>
           <w:p>
             <w:r/>
@@ -651,7 +652,7 @@
         </w:tc>
         <w:tc>
           <w:tcPr>
-            <w:tcW w:type="dxa" w:w="1814"/>
+            <w:tcW w:type="dxa" w:w="1701"/>
             <w:shd w:val="clear" w:color="auto" w:fill="EAF2FA"/>
           </w:tcPr>
           <w:p>
@@ -666,7 +667,7 @@
         </w:tc>
         <w:tc>
           <w:tcPr>
-            <w:tcW w:type="dxa" w:w="1928"/>
+            <w:tcW w:type="dxa" w:w="1814"/>
             <w:shd w:val="clear" w:color="auto" w:fill="EAF2FA"/>
           </w:tcPr>
           <w:p>
@@ -696,7 +697,7 @@
         </w:tc>
         <w:tc>
           <w:tcPr>
-            <w:tcW w:type="dxa" w:w="850"/>
+            <w:tcW w:type="dxa" w:w="964"/>
             <w:shd w:val="clear" w:color="auto" w:fill="EAF2FA"/>
           </w:tcPr>
           <w:p>
@@ -711,7 +712,7 @@
         </w:tc>
         <w:tc>
           <w:tcPr>
-            <w:tcW w:type="dxa" w:w="850"/>
+            <w:tcW w:type="dxa" w:w="964"/>
             <w:shd w:val="clear" w:color="auto" w:fill="EAF2FA"/>
           </w:tcPr>
           <w:p>
@@ -757,7 +758,7 @@
         </w:tc>
         <w:tc>
           <w:tcPr>
-            <w:tcW w:type="dxa" w:w="1814"/>
+            <w:tcW w:type="dxa" w:w="1701"/>
           </w:tcPr>
           <w:p>
             <w:r/>
@@ -771,7 +772,7 @@
         </w:tc>
         <w:tc>
           <w:tcPr>
-            <w:tcW w:type="dxa" w:w="1928"/>
+            <w:tcW w:type="dxa" w:w="1814"/>
           </w:tcPr>
           <w:p>
             <w:r/>
@@ -799,7 +800,7 @@
         </w:tc>
         <w:tc>
           <w:tcPr>
-            <w:tcW w:type="dxa" w:w="850"/>
+            <w:tcW w:type="dxa" w:w="964"/>
           </w:tcPr>
           <w:p>
             <w:r/>
@@ -813,7 +814,7 @@
         </w:tc>
         <w:tc>
           <w:tcPr>
-            <w:tcW w:type="dxa" w:w="850"/>
+            <w:tcW w:type="dxa" w:w="964"/>
           </w:tcPr>
           <w:p>
             <w:r/>
@@ -858,7 +859,7 @@
         </w:tc>
         <w:tc>
           <w:tcPr>
-            <w:tcW w:type="dxa" w:w="1814"/>
+            <w:tcW w:type="dxa" w:w="1701"/>
             <w:shd w:val="clear" w:color="auto" w:fill="EAF2FA"/>
           </w:tcPr>
           <w:p>
@@ -873,7 +874,7 @@
         </w:tc>
         <w:tc>
           <w:tcPr>
-            <w:tcW w:type="dxa" w:w="1928"/>
+            <w:tcW w:type="dxa" w:w="1814"/>
             <w:shd w:val="clear" w:color="auto" w:fill="EAF2FA"/>
           </w:tcPr>
           <w:p>
@@ -903,7 +904,7 @@
         </w:tc>
         <w:tc>
           <w:tcPr>
-            <w:tcW w:type="dxa" w:w="850"/>
+            <w:tcW w:type="dxa" w:w="964"/>
             <w:shd w:val="clear" w:color="auto" w:fill="EAF2FA"/>
           </w:tcPr>
           <w:p>
@@ -918,7 +919,7 @@
         </w:tc>
         <w:tc>
           <w:tcPr>
-            <w:tcW w:type="dxa" w:w="850"/>
+            <w:tcW w:type="dxa" w:w="964"/>
             <w:shd w:val="clear" w:color="auto" w:fill="EAF2FA"/>
           </w:tcPr>
           <w:p>
@@ -964,7 +965,7 @@
         </w:tc>
         <w:tc>
           <w:tcPr>
-            <w:tcW w:type="dxa" w:w="1814"/>
+            <w:tcW w:type="dxa" w:w="1701"/>
           </w:tcPr>
           <w:p>
             <w:r/>
@@ -978,7 +979,7 @@
         </w:tc>
         <w:tc>
           <w:tcPr>
-            <w:tcW w:type="dxa" w:w="1928"/>
+            <w:tcW w:type="dxa" w:w="1814"/>
           </w:tcPr>
           <w:p>
             <w:r/>
@@ -1006,7 +1007,7 @@
         </w:tc>
         <w:tc>
           <w:tcPr>
-            <w:tcW w:type="dxa" w:w="850"/>
+            <w:tcW w:type="dxa" w:w="964"/>
           </w:tcPr>
           <w:p>
             <w:r/>
@@ -1020,7 +1021,7 @@
         </w:tc>
         <w:tc>
           <w:tcPr>
-            <w:tcW w:type="dxa" w:w="850"/>
+            <w:tcW w:type="dxa" w:w="964"/>
           </w:tcPr>
           <w:p>
             <w:r/>
@@ -1156,7 +1157,7 @@
       <w:r>
         <w:drawing>
           <wp:inline xmlns:a="http://schemas.openxmlformats.org/drawingml/2006/main" xmlns:pic="http://schemas.openxmlformats.org/drawingml/2006/picture">
-            <wp:extent cx="1872000" cy="4160671"/>
+            <wp:extent cx="1548000" cy="3440555"/>
             <wp:docPr id="1" name="Picture 1"/>
             <wp:cNvGraphicFramePr>
               <a:graphicFrameLocks noChangeAspect="1"/>
@@ -1177,7 +1178,7 @@
                   <pic:spPr>
                     <a:xfrm>
                       <a:off x="0" y="0"/>
-                      <a:ext cx="1872000" cy="4160671"/>
+                      <a:ext cx="1548000" cy="3440555"/>
                     </a:xfrm>
                     <a:prstGeom prst="rect"/>
                   </pic:spPr>
@@ -1212,7 +1213,7 @@
       <w:r>
         <w:drawing>
           <wp:inline xmlns:a="http://schemas.openxmlformats.org/drawingml/2006/main" xmlns:pic="http://schemas.openxmlformats.org/drawingml/2006/picture">
-            <wp:extent cx="1872000" cy="4160671"/>
+            <wp:extent cx="1548000" cy="3440555"/>
             <wp:docPr id="2" name="Picture 2"/>
             <wp:cNvGraphicFramePr>
               <a:graphicFrameLocks noChangeAspect="1"/>
@@ -1233,7 +1234,7 @@
                   <pic:spPr>
                     <a:xfrm>
                       <a:off x="0" y="0"/>
-                      <a:ext cx="1872000" cy="4160671"/>
+                      <a:ext cx="1548000" cy="3440555"/>
                     </a:xfrm>
                     <a:prstGeom prst="rect"/>
                   </pic:spPr>
@@ -1268,7 +1269,7 @@
       <w:r>
         <w:drawing>
           <wp:inline xmlns:a="http://schemas.openxmlformats.org/drawingml/2006/main" xmlns:pic="http://schemas.openxmlformats.org/drawingml/2006/picture">
-            <wp:extent cx="1872000" cy="4160671"/>
+            <wp:extent cx="1548000" cy="3440555"/>
             <wp:docPr id="3" name="Picture 3"/>
             <wp:cNvGraphicFramePr>
               <a:graphicFrameLocks noChangeAspect="1"/>
@@ -1289,7 +1290,7 @@
                   <pic:spPr>
                     <a:xfrm>
                       <a:off x="0" y="0"/>
-                      <a:ext cx="1872000" cy="4160671"/>
+                      <a:ext cx="1548000" cy="3440555"/>
                     </a:xfrm>
                     <a:prstGeom prst="rect"/>
                   </pic:spPr>
@@ -1324,7 +1325,7 @@
       <w:r>
         <w:drawing>
           <wp:inline xmlns:a="http://schemas.openxmlformats.org/drawingml/2006/main" xmlns:pic="http://schemas.openxmlformats.org/drawingml/2006/picture">
-            <wp:extent cx="1872000" cy="4160671"/>
+            <wp:extent cx="1548000" cy="3440555"/>
             <wp:docPr id="4" name="Picture 4"/>
             <wp:cNvGraphicFramePr>
               <a:graphicFrameLocks noChangeAspect="1"/>
@@ -1345,7 +1346,7 @@
                   <pic:spPr>
                     <a:xfrm>
                       <a:off x="0" y="0"/>
-                      <a:ext cx="1872000" cy="4160671"/>
+                      <a:ext cx="1548000" cy="3440555"/>
                     </a:xfrm>
                     <a:prstGeom prst="rect"/>
                   </pic:spPr>
@@ -1380,7 +1381,7 @@
       <w:r>
         <w:drawing>
           <wp:inline xmlns:a="http://schemas.openxmlformats.org/drawingml/2006/main" xmlns:pic="http://schemas.openxmlformats.org/drawingml/2006/picture">
-            <wp:extent cx="1872000" cy="4160671"/>
+            <wp:extent cx="1548000" cy="3440555"/>
             <wp:docPr id="5" name="Picture 5"/>
             <wp:cNvGraphicFramePr>
               <a:graphicFrameLocks noChangeAspect="1"/>
@@ -1401,7 +1402,7 @@
                   <pic:spPr>
                     <a:xfrm>
                       <a:off x="0" y="0"/>
-                      <a:ext cx="1872000" cy="4160671"/>
+                      <a:ext cx="1548000" cy="3440555"/>
                     </a:xfrm>
                     <a:prstGeom prst="rect"/>
                   </pic:spPr>
@@ -1451,6 +1452,7 @@
       <w:tblPr>
         <w:tblW w:type="auto" w:w="0"/>
         <w:jc w:val="center"/>
+        <w:tblLayout w:type="fixed"/>
         <w:tblLook w:firstColumn="1" w:firstRow="1" w:lastColumn="0" w:lastRow="0" w:noHBand="0" w:noVBand="1" w:val="04A0"/>
         <w:tblBorders>
           <w:top w:val="single" w:sz="6" w:color="9DC3E6"/>
@@ -2454,7 +2456,7 @@
       <w:r>
         <w:drawing>
           <wp:inline xmlns:a="http://schemas.openxmlformats.org/drawingml/2006/main" xmlns:pic="http://schemas.openxmlformats.org/drawingml/2006/picture">
-            <wp:extent cx="1872000" cy="4160671"/>
+            <wp:extent cx="1548000" cy="3440555"/>
             <wp:docPr id="6" name="Picture 6"/>
             <wp:cNvGraphicFramePr>
               <a:graphicFrameLocks noChangeAspect="1"/>
@@ -2475,7 +2477,7 @@
                   <pic:spPr>
                     <a:xfrm>
                       <a:off x="0" y="0"/>
-                      <a:ext cx="1872000" cy="4160671"/>
+                      <a:ext cx="1548000" cy="3440555"/>
                     </a:xfrm>
                     <a:prstGeom prst="rect"/>
                   </pic:spPr>
@@ -2798,7 +2800,7 @@
       <w:r>
         <w:drawing>
           <wp:inline xmlns:a="http://schemas.openxmlformats.org/drawingml/2006/main" xmlns:pic="http://schemas.openxmlformats.org/drawingml/2006/picture">
-            <wp:extent cx="1872000" cy="4160671"/>
+            <wp:extent cx="1548000" cy="3440555"/>
             <wp:docPr id="7" name="Picture 7"/>
             <wp:cNvGraphicFramePr>
               <a:graphicFrameLocks noChangeAspect="1"/>
@@ -2819,7 +2821,7 @@
                   <pic:spPr>
                     <a:xfrm>
                       <a:off x="0" y="0"/>
-                      <a:ext cx="1872000" cy="4160671"/>
+                      <a:ext cx="1548000" cy="3440555"/>
                     </a:xfrm>
                     <a:prstGeom prst="rect"/>
                   </pic:spPr>
@@ -3142,7 +3144,7 @@
       <w:r>
         <w:drawing>
           <wp:inline xmlns:a="http://schemas.openxmlformats.org/drawingml/2006/main" xmlns:pic="http://schemas.openxmlformats.org/drawingml/2006/picture">
-            <wp:extent cx="1872000" cy="4160671"/>
+            <wp:extent cx="1548000" cy="3440555"/>
             <wp:docPr id="8" name="Picture 8"/>
             <wp:cNvGraphicFramePr>
               <a:graphicFrameLocks noChangeAspect="1"/>
@@ -3163,7 +3165,7 @@
                   <pic:spPr>
                     <a:xfrm>
                       <a:off x="0" y="0"/>
-                      <a:ext cx="1872000" cy="4160671"/>
+                      <a:ext cx="1548000" cy="3440555"/>
                     </a:xfrm>
                     <a:prstGeom prst="rect"/>
                   </pic:spPr>
@@ -3486,7 +3488,7 @@
       <w:r>
         <w:drawing>
           <wp:inline xmlns:a="http://schemas.openxmlformats.org/drawingml/2006/main" xmlns:pic="http://schemas.openxmlformats.org/drawingml/2006/picture">
-            <wp:extent cx="1872000" cy="4160671"/>
+            <wp:extent cx="1548000" cy="3440555"/>
             <wp:docPr id="9" name="Picture 9"/>
             <wp:cNvGraphicFramePr>
               <a:graphicFrameLocks noChangeAspect="1"/>
@@ -3507,7 +3509,7 @@
                   <pic:spPr>
                     <a:xfrm>
                       <a:off x="0" y="0"/>
-                      <a:ext cx="1872000" cy="4160671"/>
+                      <a:ext cx="1548000" cy="3440555"/>
                     </a:xfrm>
                     <a:prstGeom prst="rect"/>
                   </pic:spPr>
@@ -3830,7 +3832,7 @@
       <w:r>
         <w:drawing>
           <wp:inline xmlns:a="http://schemas.openxmlformats.org/drawingml/2006/main" xmlns:pic="http://schemas.openxmlformats.org/drawingml/2006/picture">
-            <wp:extent cx="1872000" cy="4160671"/>
+            <wp:extent cx="1548000" cy="3440555"/>
             <wp:docPr id="10" name="Picture 10"/>
             <wp:cNvGraphicFramePr>
               <a:graphicFrameLocks noChangeAspect="1"/>
@@ -3851,7 +3853,7 @@
                   <pic:spPr>
                     <a:xfrm>
                       <a:off x="0" y="0"/>
-                      <a:ext cx="1872000" cy="4160671"/>
+                      <a:ext cx="1548000" cy="3440555"/>
                     </a:xfrm>
                     <a:prstGeom prst="rect"/>
                   </pic:spPr>
@@ -4142,7 +4144,7 @@
       <w:r>
         <w:drawing>
           <wp:inline xmlns:a="http://schemas.openxmlformats.org/drawingml/2006/main" xmlns:pic="http://schemas.openxmlformats.org/drawingml/2006/picture">
-            <wp:extent cx="1872000" cy="4160671"/>
+            <wp:extent cx="1548000" cy="3440555"/>
             <wp:docPr id="11" name="Picture 11"/>
             <wp:cNvGraphicFramePr>
               <a:graphicFrameLocks noChangeAspect="1"/>
@@ -4163,7 +4165,7 @@
                   <pic:spPr>
                     <a:xfrm>
                       <a:off x="0" y="0"/>
-                      <a:ext cx="1872000" cy="4160671"/>
+                      <a:ext cx="1548000" cy="3440555"/>
                     </a:xfrm>
                     <a:prstGeom prst="rect"/>
                   </pic:spPr>
@@ -4454,7 +4456,7 @@
       <w:r>
         <w:drawing>
           <wp:inline xmlns:a="http://schemas.openxmlformats.org/drawingml/2006/main" xmlns:pic="http://schemas.openxmlformats.org/drawingml/2006/picture">
-            <wp:extent cx="1872000" cy="4160671"/>
+            <wp:extent cx="1548000" cy="3440555"/>
             <wp:docPr id="12" name="Picture 12"/>
             <wp:cNvGraphicFramePr>
               <a:graphicFrameLocks noChangeAspect="1"/>
@@ -4475,7 +4477,7 @@
                   <pic:spPr>
                     <a:xfrm>
                       <a:off x="0" y="0"/>
-                      <a:ext cx="1872000" cy="4160671"/>
+                      <a:ext cx="1548000" cy="3440555"/>
                     </a:xfrm>
                     <a:prstGeom prst="rect"/>
                   </pic:spPr>
@@ -4781,6 +4783,7 @@
       <w:tblPr>
         <w:tblW w:type="auto" w:w="0"/>
         <w:jc w:val="center"/>
+        <w:tblLayout w:type="fixed"/>
         <w:tblLook w:firstColumn="1" w:firstRow="1" w:lastColumn="0" w:lastRow="0" w:noHBand="0" w:noVBand="1" w:val="04A0"/>
         <w:tblBorders>
           <w:top w:val="single" w:sz="6" w:color="9DC3E6"/>
@@ -5097,6 +5100,7 @@
       <w:tblPr>
         <w:tblW w:type="auto" w:w="0"/>
         <w:jc w:val="center"/>
+        <w:tblLayout w:type="fixed"/>
         <w:tblLook w:firstColumn="1" w:firstRow="1" w:lastColumn="0" w:lastRow="0" w:noHBand="0" w:noVBand="1" w:val="04A0"/>
         <w:tblBorders>
           <w:top w:val="single" w:sz="6" w:color="9DC3E6"/>

</xml_diff>

<commit_message>
docs(s08): agregar PDF, escenario de cancelacion verificado en emulador, portada con sesion y enlaces a commits
</commit_message>
<xml_diff>
--- a/docs/entrega/S08_ActividadAutonoma_RodriguezBazan.docx
+++ b/docs/entrega/S08_ActividadAutonoma_RodriguezBazan.docx
@@ -220,6 +220,38 @@
                 <w:b/>
                 <w:sz w:val="18"/>
               </w:rPr>
+              <w:t>Sesión</w:t>
+            </w:r>
+          </w:p>
+        </w:tc>
+        <w:tc>
+          <w:tcPr>
+            <w:tcW w:type="dxa" w:w="7030"/>
+          </w:tcPr>
+          <w:p>
+            <w:r/>
+            <w:r>
+              <w:rPr>
+                <w:sz w:val="18"/>
+              </w:rPr>
+              <w:t>Sesión 08 · Pruebas integrales de CRUD REST y taxonomía de errores</w:t>
+            </w:r>
+          </w:p>
+        </w:tc>
+      </w:tr>
+      <w:tr>
+        <w:tc>
+          <w:tcPr>
+            <w:tcW w:type="dxa" w:w="2381"/>
+            <w:shd w:val="clear" w:color="auto" w:fill="EAF2FA"/>
+          </w:tcPr>
+          <w:p>
+            <w:r/>
+            <w:r>
+              <w:rPr>
+                <w:b/>
+                <w:sz w:val="18"/>
+              </w:rPr>
               <w:t>Rama</w:t>
             </w:r>
           </w:p>
@@ -234,7 +266,7 @@
               <w:rPr>
                 <w:sz w:val="18"/>
               </w:rPr>
-              <w:t>feature/ktor-client</w:t>
+              <w:t>feature/ktor-client · https://github.com/fabianrodriguez33/Pharma-Mobil/tree/feature/ktor-client</w:t>
             </w:r>
           </w:p>
         </w:tc>
@@ -356,6 +388,17 @@
           <w:sz w:val="19"/>
         </w:rPr>
         <w:t>El escenario 7 se reprodujo reduciendo temporalmente requestTimeoutMillis a 1 ms; el valor original (15 000 ms) fue restaurado.</w:t>
+      </w:r>
+    </w:p>
+    <w:p>
+      <w:pPr>
+        <w:pStyle w:val="ListBullet"/>
+      </w:pPr>
+      <w:r>
+        <w:rPr>
+          <w:sz w:val="19"/>
+        </w:rPr>
+        <w:t>No se incluyen capturas ni pruebas de iOS: el entorno de desarrollo es Windows y no dispone de macOS/Xcode. Todas las capturas son de Android; la lógica compartida (commonTest) no depende de la plataforma.</w:t>
       </w:r>
     </w:p>
     <w:p>
@@ -4556,7 +4599,7 @@
               <w:rPr>
                 <w:sz w:val="18"/>
               </w:rPr>
-              <w:t>01/10/2026 · prueba automatizada</w:t>
+              <w:t>01/10/2026 · 22:02 (emulador) + pruebas automatizadas</w:t>
             </w:r>
           </w:p>
         </w:tc>
@@ -4620,7 +4663,7 @@
               <w:rPr>
                 <w:sz w:val="18"/>
               </w:rPr>
-              <w:t>Pruebas ErrorApiTest en commonTest: toErrorApi() con CancellationException y cancelación del Job mientras traducirErrores {} espera la respuesta.</w:t>
+              <w:t>Se congeló el contenedor Oracle (docker pause) para dejar la petición GET en vuelo. Se abrió Inventario (spinner «Cargando inventario…», Figura 13) y se salió de la app con la tecla Atrás, lo que destruye la pantalla y cancela el viewModelScope. Después se descongeló la base y se reabrió la app (Figura 14).</w:t>
             </w:r>
           </w:p>
         </w:tc>
@@ -4638,7 +4681,7 @@
                 <w:b/>
                 <w:sz w:val="18"/>
               </w:rPr>
-              <w:t>Excepción</w:t>
+              <w:t>Excepción observada</w:t>
             </w:r>
           </w:p>
         </w:tc>
@@ -4652,7 +4695,7 @@
               <w:rPr>
                 <w:sz w:val="18"/>
               </w:rPr>
-              <w:t>CancellationException</w:t>
+              <w:t>kotlinx.coroutines.JobCancellationException: Job was cancelled; job=SupervisorJobImpl{Cancelling} (logcat_cancelacion.log). No hubo FATAL EXCEPTION.</w:t>
             </w:r>
           </w:p>
         </w:tc>
@@ -4684,7 +4727,7 @@
               <w:rPr>
                 <w:sz w:val="18"/>
               </w:rPr>
-              <w:t>Ninguno: la excepción se relanza antes del catch genérico.</w:t>
+              <w:t>Ninguno. toErrorApi() y traducirErrores relanzan la CancellationException antes del catch genérico, así que no se convierte en ErrorApi.Desconocido.</w:t>
             </w:r>
           </w:p>
         </w:tc>
@@ -4716,7 +4759,39 @@
               <w:rPr>
                 <w:sz w:val="18"/>
               </w:rPr>
-              <w:t>Ninguno.</w:t>
+              <w:t>Ninguno: no se muestra error porque la pantalla ya no existe.</w:t>
+            </w:r>
+          </w:p>
+        </w:tc>
+      </w:tr>
+      <w:tr>
+        <w:tc>
+          <w:tcPr>
+            <w:tcW w:type="dxa" w:w="2381"/>
+            <w:shd w:val="clear" w:color="auto" w:fill="EAF2FA"/>
+          </w:tcPr>
+          <w:p>
+            <w:r/>
+            <w:r>
+              <w:rPr>
+                <w:b/>
+                <w:sz w:val="18"/>
+              </w:rPr>
+              <w:t>Qué ocurre realmente</w:t>
+            </w:r>
+          </w:p>
+        </w:tc>
+        <w:tc>
+          <w:tcPr>
+            <w:tcW w:type="dxa" w:w="7030"/>
+          </w:tcPr>
+          <w:p>
+            <w:r/>
+            <w:r>
+              <w:rPr>
+                <w:sz w:val="18"/>
+              </w:rPr>
+              <w:t>En esta implementación el ViewModel es de la pantalla: al salir se cancela la corrutina, Ktor registra la petición como cancelada y el proceso sigue vivo. Al volver, se crea un estado nuevo y la carga termina en Fase.ConProductos con la lista real; no queda estado corrupto.</w:t>
             </w:r>
           </w:p>
         </w:tc>
@@ -4748,7 +4823,7 @@
               <w:rPr>
                 <w:sz w:val="18"/>
               </w:rPr>
-              <w:t>Verificado por pruebas (4/4 en ErrorApiTest): la corrutina cancelada termina limpiamente, no se convierte en ErrorApi.Desconocido y no deja la UI en error.</w:t>
+              <w:t>Verificado en el emulador y con ErrorApiTest (4/4). Distinto del timeout (escenario 7): el timeout es una IOException que sí se traduce a TiempoAgotado; la cancelación es cooperativa y debe propagarse, porque tragarla dejaría la corrutina colgada.</w:t>
             </w:r>
           </w:p>
         </w:tc>
@@ -4758,6 +4833,118 @@
       <w:pPr>
         <w:spacing w:after="40"/>
       </w:pPr>
+    </w:p>
+    <w:p>
+      <w:pPr>
+        <w:keepNext/>
+        <w:spacing w:after="0"/>
+        <w:jc w:val="center"/>
+      </w:pPr>
+      <w:r>
+        <w:drawing>
+          <wp:inline xmlns:a="http://schemas.openxmlformats.org/drawingml/2006/main" xmlns:pic="http://schemas.openxmlformats.org/drawingml/2006/picture">
+            <wp:extent cx="1548000" cy="3440555"/>
+            <wp:docPr id="13" name="Picture 13"/>
+            <wp:cNvGraphicFramePr>
+              <a:graphicFrameLocks noChangeAspect="1"/>
+            </wp:cNvGraphicFramePr>
+            <a:graphic>
+              <a:graphicData uri="http://schemas.openxmlformats.org/drawingml/2006/picture">
+                <pic:pic>
+                  <pic:nvPicPr>
+                    <pic:cNvPr id="0" name="14_s8_cancelacion_en_curso.jpg"/>
+                    <pic:cNvPicPr/>
+                  </pic:nvPicPr>
+                  <pic:blipFill>
+                    <a:blip r:embed="rId23"/>
+                    <a:stretch>
+                      <a:fillRect/>
+                    </a:stretch>
+                  </pic:blipFill>
+                  <pic:spPr>
+                    <a:xfrm>
+                      <a:off x="0" y="0"/>
+                      <a:ext cx="1548000" cy="3440555"/>
+                    </a:xfrm>
+                    <a:prstGeom prst="rect"/>
+                  </pic:spPr>
+                </pic:pic>
+              </a:graphicData>
+            </a:graphic>
+          </wp:inline>
+        </w:drawing>
+      </w:r>
+    </w:p>
+    <w:p>
+      <w:pPr>
+        <w:spacing w:after="160"/>
+        <w:jc w:val="center"/>
+      </w:pPr>
+      <w:r>
+        <w:rPr>
+          <w:b w:val="0"/>
+          <w:i/>
+          <w:color w:val="595959"/>
+          <w:sz w:val="17"/>
+        </w:rPr>
+        <w:t>Figura 13. Escenario 8: petición en vuelo con la base de datos congelada.</w:t>
+      </w:r>
+    </w:p>
+    <w:p>
+      <w:pPr>
+        <w:keepNext/>
+        <w:spacing w:after="0"/>
+        <w:jc w:val="center"/>
+      </w:pPr>
+      <w:r>
+        <w:drawing>
+          <wp:inline xmlns:a="http://schemas.openxmlformats.org/drawingml/2006/main" xmlns:pic="http://schemas.openxmlformats.org/drawingml/2006/picture">
+            <wp:extent cx="1548000" cy="3440555"/>
+            <wp:docPr id="14" name="Picture 14"/>
+            <wp:cNvGraphicFramePr>
+              <a:graphicFrameLocks noChangeAspect="1"/>
+            </wp:cNvGraphicFramePr>
+            <a:graphic>
+              <a:graphicData uri="http://schemas.openxmlformats.org/drawingml/2006/picture">
+                <pic:pic>
+                  <pic:nvPicPr>
+                    <pic:cNvPr id="0" name="15_s8_recuperacion.jpg"/>
+                    <pic:cNvPicPr/>
+                  </pic:nvPicPr>
+                  <pic:blipFill>
+                    <a:blip r:embed="rId24"/>
+                    <a:stretch>
+                      <a:fillRect/>
+                    </a:stretch>
+                  </pic:blipFill>
+                  <pic:spPr>
+                    <a:xfrm>
+                      <a:off x="0" y="0"/>
+                      <a:ext cx="1548000" cy="3440555"/>
+                    </a:xfrm>
+                    <a:prstGeom prst="rect"/>
+                  </pic:spPr>
+                </pic:pic>
+              </a:graphicData>
+            </a:graphic>
+          </wp:inline>
+        </w:drawing>
+      </w:r>
+    </w:p>
+    <w:p>
+      <w:pPr>
+        <w:spacing w:after="160"/>
+        <w:jc w:val="center"/>
+      </w:pPr>
+      <w:r>
+        <w:rPr>
+          <w:b w:val="0"/>
+          <w:i/>
+          <w:color w:val="595959"/>
+          <w:sz w:val="17"/>
+        </w:rPr>
+        <w:t>Figura 14. Escenario 8: tras reabrir y descongelar la base, la carga termina con normalidad.</w:t>
+      </w:r>
     </w:p>
     <w:p>
       <w:pPr>
@@ -6441,6 +6628,370 @@
       </w:pPr>
       <w:r>
         <w:rPr>
+          <w:b/>
+          <w:i w:val="0"/>
+        </w:rPr>
+        <w:t>Commits de la actividad (rama feature/ktor-client):</w:t>
+      </w:r>
+    </w:p>
+    <w:tbl>
+      <w:tblPr>
+        <w:tblW w:type="auto" w:w="0"/>
+        <w:jc w:val="center"/>
+        <w:tblLayout w:type="fixed"/>
+        <w:tblLook w:firstColumn="1" w:firstRow="1" w:lastColumn="0" w:lastRow="0" w:noHBand="0" w:noVBand="1" w:val="04A0"/>
+        <w:tblBorders>
+          <w:top w:val="single" w:sz="6" w:color="9DC3E6"/>
+          <w:left w:val="single" w:sz="6" w:color="9DC3E6"/>
+          <w:bottom w:val="single" w:sz="6" w:color="9DC3E6"/>
+          <w:right w:val="single" w:sz="6" w:color="9DC3E6"/>
+          <w:insideH w:val="single" w:sz="6" w:color="9DC3E6"/>
+          <w:insideV w:val="single" w:sz="6" w:color="9DC3E6"/>
+        </w:tblBorders>
+      </w:tblPr>
+      <w:tblGrid>
+        <w:gridCol w:w="3137"/>
+        <w:gridCol w:w="3137"/>
+        <w:gridCol w:w="3137"/>
+      </w:tblGrid>
+      <w:tr>
+        <w:tc>
+          <w:tcPr>
+            <w:tcW w:type="dxa" w:w="1020"/>
+            <w:shd w:val="clear" w:color="auto" w:fill="1F4E79"/>
+          </w:tcPr>
+          <w:p>
+            <w:r/>
+            <w:r>
+              <w:rPr>
+                <w:b/>
+                <w:color w:val="FFFFFF"/>
+                <w:sz w:val="16"/>
+              </w:rPr>
+              <w:t>Commit</w:t>
+            </w:r>
+          </w:p>
+        </w:tc>
+        <w:tc>
+          <w:tcPr>
+            <w:tcW w:type="dxa" w:w="4309"/>
+            <w:shd w:val="clear" w:color="auto" w:fill="1F4E79"/>
+          </w:tcPr>
+          <w:p>
+            <w:r/>
+            <w:r>
+              <w:rPr>
+                <w:b/>
+                <w:color w:val="FFFFFF"/>
+                <w:sz w:val="16"/>
+              </w:rPr>
+              <w:t>Mensaje</w:t>
+            </w:r>
+          </w:p>
+        </w:tc>
+        <w:tc>
+          <w:tcPr>
+            <w:tcW w:type="dxa" w:w="4082"/>
+            <w:shd w:val="clear" w:color="auto" w:fill="1F4E79"/>
+          </w:tcPr>
+          <w:p>
+            <w:r/>
+            <w:r>
+              <w:rPr>
+                <w:b/>
+                <w:color w:val="FFFFFF"/>
+                <w:sz w:val="16"/>
+              </w:rPr>
+              <w:t>Enlace</w:t>
+            </w:r>
+          </w:p>
+        </w:tc>
+      </w:tr>
+      <w:tr>
+        <w:tc>
+          <w:tcPr>
+            <w:tcW w:type="dxa" w:w="1020"/>
+          </w:tcPr>
+          <w:p>
+            <w:r/>
+            <w:r>
+              <w:rPr>
+                <w:sz w:val="16"/>
+              </w:rPr>
+              <w:t>8f716de</w:t>
+            </w:r>
+          </w:p>
+        </w:tc>
+        <w:tc>
+          <w:tcPr>
+            <w:tcW w:type="dxa" w:w="4309"/>
+          </w:tcPr>
+          <w:p>
+            <w:r/>
+            <w:r>
+              <w:rPr>
+                <w:sz w:val="16"/>
+              </w:rPr>
+              <w:t>docs(s08): ajustar anchos de tabla y tamano de capturas en el informe</w:t>
+            </w:r>
+          </w:p>
+        </w:tc>
+        <w:tc>
+          <w:tcPr>
+            <w:tcW w:type="dxa" w:w="4082"/>
+          </w:tcPr>
+          <w:p>
+            <w:r/>
+            <w:r>
+              <w:rPr>
+                <w:sz w:val="16"/>
+              </w:rPr>
+              <w:t>https://github.com/fabianrodriguez33/Pharma-Mobil/commit/8f716de</w:t>
+            </w:r>
+          </w:p>
+        </w:tc>
+      </w:tr>
+      <w:tr>
+        <w:tc>
+          <w:tcPr>
+            <w:tcW w:type="dxa" w:w="1020"/>
+            <w:shd w:val="clear" w:color="auto" w:fill="EAF2FA"/>
+          </w:tcPr>
+          <w:p>
+            <w:r/>
+            <w:r>
+              <w:rPr>
+                <w:sz w:val="16"/>
+              </w:rPr>
+              <w:t>93a73c6</w:t>
+            </w:r>
+          </w:p>
+        </w:tc>
+        <w:tc>
+          <w:tcPr>
+            <w:tcW w:type="dxa" w:w="4309"/>
+            <w:shd w:val="clear" w:color="auto" w:fill="EAF2FA"/>
+          </w:tcPr>
+          <w:p>
+            <w:r/>
+            <w:r>
+              <w:rPr>
+                <w:sz w:val="16"/>
+              </w:rPr>
+              <w:t>docs(s08): completar informe en Word de actividad autonoma 08 y actualizar readme</w:t>
+            </w:r>
+          </w:p>
+        </w:tc>
+        <w:tc>
+          <w:tcPr>
+            <w:tcW w:type="dxa" w:w="4082"/>
+            <w:shd w:val="clear" w:color="auto" w:fill="EAF2FA"/>
+          </w:tcPr>
+          <w:p>
+            <w:r/>
+            <w:r>
+              <w:rPr>
+                <w:sz w:val="16"/>
+              </w:rPr>
+              <w:t>https://github.com/fabianrodriguez33/Pharma-Mobil/commit/93a73c6</w:t>
+            </w:r>
+          </w:p>
+        </w:tc>
+      </w:tr>
+      <w:tr>
+        <w:tc>
+          <w:tcPr>
+            <w:tcW w:type="dxa" w:w="1020"/>
+          </w:tcPr>
+          <w:p>
+            <w:r/>
+            <w:r>
+              <w:rPr>
+                <w:sz w:val="16"/>
+              </w:rPr>
+              <w:t>3a1f5e5</w:t>
+            </w:r>
+          </w:p>
+        </w:tc>
+        <w:tc>
+          <w:tcPr>
+            <w:tcW w:type="dxa" w:w="4309"/>
+          </w:tcPr>
+          <w:p>
+            <w:r/>
+            <w:r>
+              <w:rPr>
+                <w:sz w:val="16"/>
+              </w:rPr>
+              <w:t>docs(s08): agregar documento de entrega de la guia 08</w:t>
+            </w:r>
+          </w:p>
+        </w:tc>
+        <w:tc>
+          <w:tcPr>
+            <w:tcW w:type="dxa" w:w="4082"/>
+          </w:tcPr>
+          <w:p>
+            <w:r/>
+            <w:r>
+              <w:rPr>
+                <w:sz w:val="16"/>
+              </w:rPr>
+              <w:t>https://github.com/fabianrodriguez33/Pharma-Mobil/commit/3a1f5e5</w:t>
+            </w:r>
+          </w:p>
+        </w:tc>
+      </w:tr>
+      <w:tr>
+        <w:tc>
+          <w:tcPr>
+            <w:tcW w:type="dxa" w:w="1020"/>
+            <w:shd w:val="clear" w:color="auto" w:fill="EAF2FA"/>
+          </w:tcPr>
+          <w:p>
+            <w:r/>
+            <w:r>
+              <w:rPr>
+                <w:sz w:val="16"/>
+              </w:rPr>
+              <w:t>329eca4</w:t>
+            </w:r>
+          </w:p>
+        </w:tc>
+        <w:tc>
+          <w:tcPr>
+            <w:tcW w:type="dxa" w:w="4309"/>
+            <w:shd w:val="clear" w:color="auto" w:fill="EAF2FA"/>
+          </w:tcPr>
+          <w:p>
+            <w:r/>
+            <w:r>
+              <w:rPr>
+                <w:sz w:val="16"/>
+              </w:rPr>
+              <w:t>test(s08): cubrir el mapper de producto (inactivos y request)</w:t>
+            </w:r>
+          </w:p>
+        </w:tc>
+        <w:tc>
+          <w:tcPr>
+            <w:tcW w:type="dxa" w:w="4082"/>
+            <w:shd w:val="clear" w:color="auto" w:fill="EAF2FA"/>
+          </w:tcPr>
+          <w:p>
+            <w:r/>
+            <w:r>
+              <w:rPr>
+                <w:sz w:val="16"/>
+              </w:rPr>
+              <w:t>https://github.com/fabianrodriguez33/Pharma-Mobil/commit/329eca4</w:t>
+            </w:r>
+          </w:p>
+        </w:tc>
+      </w:tr>
+      <w:tr>
+        <w:tc>
+          <w:tcPr>
+            <w:tcW w:type="dxa" w:w="1020"/>
+          </w:tcPr>
+          <w:p>
+            <w:r/>
+            <w:r>
+              <w:rPr>
+                <w:sz w:val="16"/>
+              </w:rPr>
+              <w:t>c53282f</w:t>
+            </w:r>
+          </w:p>
+        </w:tc>
+        <w:tc>
+          <w:tcPr>
+            <w:tcW w:type="dxa" w:w="4309"/>
+          </w:tcPr>
+          <w:p>
+            <w:r/>
+            <w:r>
+              <w:rPr>
+                <w:sz w:val="16"/>
+              </w:rPr>
+              <w:t>fix(s08): enviar valores por defecto en el body y omitir productos inactivos; evidencias e2e</w:t>
+            </w:r>
+          </w:p>
+        </w:tc>
+        <w:tc>
+          <w:tcPr>
+            <w:tcW w:type="dxa" w:w="4082"/>
+          </w:tcPr>
+          <w:p>
+            <w:r/>
+            <w:r>
+              <w:rPr>
+                <w:sz w:val="16"/>
+              </w:rPr>
+              <w:t>https://github.com/fabianrodriguez33/Pharma-Mobil/commit/c53282f</w:t>
+            </w:r>
+          </w:p>
+        </w:tc>
+      </w:tr>
+      <w:tr>
+        <w:tc>
+          <w:tcPr>
+            <w:tcW w:type="dxa" w:w="1020"/>
+            <w:shd w:val="clear" w:color="auto" w:fill="EAF2FA"/>
+          </w:tcPr>
+          <w:p>
+            <w:r/>
+            <w:r>
+              <w:rPr>
+                <w:sz w:val="16"/>
+              </w:rPr>
+              <w:t>f4e321a</w:t>
+            </w:r>
+          </w:p>
+        </w:tc>
+        <w:tc>
+          <w:tcPr>
+            <w:tcW w:type="dxa" w:w="4309"/>
+            <w:shd w:val="clear" w:color="auto" w:fill="EAF2FA"/>
+          </w:tcPr>
+          <w:p>
+            <w:r/>
+            <w:r>
+              <w:rPr>
+                <w:sz w:val="16"/>
+              </w:rPr>
+              <w:t>feat(s08): implementar crud rest completo con ktor y estados de ui</w:t>
+            </w:r>
+          </w:p>
+        </w:tc>
+        <w:tc>
+          <w:tcPr>
+            <w:tcW w:type="dxa" w:w="4082"/>
+            <w:shd w:val="clear" w:color="auto" w:fill="EAF2FA"/>
+          </w:tcPr>
+          <w:p>
+            <w:r/>
+            <w:r>
+              <w:rPr>
+                <w:sz w:val="16"/>
+              </w:rPr>
+              <w:t>https://github.com/fabianrodriguez33/Pharma-Mobil/commit/f4e321a</w:t>
+            </w:r>
+          </w:p>
+        </w:tc>
+      </w:tr>
+    </w:tbl>
+    <w:p>
+      <w:pPr>
+        <w:spacing w:after="40"/>
+      </w:pPr>
+    </w:p>
+    <w:p>
+      <w:pPr>
+        <w:spacing w:after="80"/>
+      </w:pPr>
+      <w:r>
+        <w:rPr>
           <w:b w:val="0"/>
           <w:i w:val="0"/>
         </w:rPr>

</xml_diff>